<commit_message>
Kim11-2-11-Titrasyon: gorsel alanlarina Shutter onizlemeleri yerlestirildi (2.3 bicimi)
</commit_message>
<xml_diff>
--- a/Kim11-2-11-Titrasyon.docx
+++ b/Kim11-2-11-Titrasyon.docx
@@ -146,77 +146,60 @@
           <w:tcPr>
             <w:tcW w:w="4500" w:type="dxa"/>
           </w:tcPr>
-          <w:tbl>
-            <w:tblPr>
-              <w:tblW w:w="4300" w:type="dxa"/>
+          <w:p>
+            <w:pPr>
               <w:jc w:val="center"/>
-              <w:tblBorders>
-                <w:top w:val="single" w:sz="8" w:space="0" w:color="7F7F7F"/>
-                <w:left w:val="single" w:sz="8" w:space="0" w:color="7F7F7F"/>
-                <w:bottom w:val="single" w:sz="8" w:space="0" w:color="7F7F7F"/>
-                <w:right w:val="single" w:sz="8" w:space="0" w:color="7F7F7F"/>
-              </w:tblBorders>
-            </w:tblPr>
-            <w:tblGrid>
-              <w:gridCol w:w="4300"/>
-            </w:tblGrid>
-            <w:tr>
-              <w:tc>
-                <w:tcPr>
-                  <w:tcW w:w="4300" w:type="dxa"/>
-                  <w:shd w:val="clear" w:color="auto" w:fill="EDEDED"/>
-                </w:tcPr>
-                <w:p>
-                  <w:pPr>
-                    <w:jc w:val="both"/>
-                    <w:rPr>
-                      <w:rFonts w:ascii="Times New Roman" w:hAnsi="Times New Roman" w:cs="Times New Roman"/>
-                      <w:lang w:val="tr-TR"/>
-                    </w:rPr>
-                  </w:pPr>
-                  <w:r>
-                    <w:rPr>
-                      <w:rFonts w:ascii="Times New Roman" w:hAnsi="Times New Roman" w:cs="Times New Roman"/>
-                      <w:lang w:val="tr-TR"/>
-                    </w:rPr>
-                    <w:t xml:space="preserve">GÖRSEL ALANI (Shutterstock)</w:t>
-                  </w:r>
-                </w:p>
-                <w:p>
-                  <w:pPr>
-                    <w:jc w:val="both"/>
-                    <w:rPr>
-                      <w:rFonts w:ascii="Times New Roman" w:hAnsi="Times New Roman" w:cs="Times New Roman"/>
-                      <w:lang w:val="tr-TR"/>
-                    </w:rPr>
-                  </w:pPr>
-                  <w:r>
-                    <w:rPr>
-                      <w:rFonts w:ascii="Times New Roman" w:hAnsi="Times New Roman" w:cs="Times New Roman"/>
-                      <w:lang w:val="tr-TR"/>
-                    </w:rPr>
-                    <w:t xml:space="preserve">Tarif: Bürete bağlı musluktan erlenmayerdeki çözeltiye damla damla sıvı eklenirken çözeltinin açık pembe renge döndüğü an; önlük ve eldivenli eller.</w:t>
-                  </w:r>
-                </w:p>
-                <w:p>
-                  <w:pPr>
-                    <w:jc w:val="both"/>
-                    <w:rPr>
-                      <w:rFonts w:ascii="Times New Roman" w:hAnsi="Times New Roman" w:cs="Times New Roman"/>
-                      <w:lang w:val="tr-TR"/>
-                    </w:rPr>
-                  </w:pPr>
-                  <w:r>
-                    <w:rPr>
-                      <w:rFonts w:ascii="Times New Roman" w:hAnsi="Times New Roman" w:cs="Times New Roman"/>
-                      <w:lang w:val="tr-TR"/>
-                    </w:rPr>
-                    <w:t xml:space="preserve">Shutter ID: 663997309 (fotoğraf) — Acid-base titration, burette and Erlenmeyer flask with pink solution</w:t>
-                  </w:r>
-                </w:p>
-              </w:tc>
-            </w:tr>
-          </w:tbl>
+            </w:pPr>
+            <w:r>
+              <w:drawing>
+                <wp:inline xmlns:a="http://schemas.openxmlformats.org/drawingml/2006/main" xmlns:pic="http://schemas.openxmlformats.org/drawingml/2006/picture">
+                  <wp:extent cx="1588950" cy="1980000"/>
+                  <wp:docPr id="900013" name="Picture 900013"/>
+                  <wp:cNvGraphicFramePr>
+                    <a:graphicFrameLocks noChangeAspect="1"/>
+                  </wp:cNvGraphicFramePr>
+                  <a:graphic>
+                    <a:graphicData uri="http://schemas.openxmlformats.org/drawingml/2006/picture">
+                      <pic:pic>
+                        <pic:nvPicPr>
+                          <pic:cNvPr id="0" name="663997309_d.jpg"/>
+                          <pic:cNvPicPr/>
+                        </pic:nvPicPr>
+                        <pic:blipFill>
+                          <a:blip r:embed="rId13"/>
+                          <a:stretch>
+                            <a:fillRect/>
+                          </a:stretch>
+                        </pic:blipFill>
+                        <pic:spPr>
+                          <a:xfrm>
+                            <a:off x="0" y="0"/>
+                            <a:ext cx="1588950" cy="1980000"/>
+                          </a:xfrm>
+                          <a:prstGeom prst="rect"/>
+                        </pic:spPr>
+                      </pic:pic>
+                    </a:graphicData>
+                  </a:graphic>
+                </wp:inline>
+              </w:drawing>
+            </w:r>
+          </w:p>
+          <w:p>
+            <w:pPr>
+              <w:jc w:val="center"/>
+            </w:pPr>
+            <w:r>
+              <w:rPr>
+                <w:rFonts w:ascii="Times New Roman" w:hAnsi="Times New Roman" w:cs="Times New Roman"/>
+                <w:b/>
+                <w:bCs/>
+                <w:highlight w:val="yellow"/>
+                <w:lang w:val="tr-TR"/>
+              </w:rPr>
+              <w:t xml:space="preserve">Shutter id: 663997309</w:t>
+            </w:r>
+          </w:p>
           <w:p>
             <w:pPr>
               <w:jc w:val="center"/>

</xml_diff>

<commit_message>
2.11: titrasyon tanimi ile es degerlik noktasi paragraflari arasina cizilmis titrasyon duzenegi ve buret okumasi gorselleri (Gorsel C, D) eklendi
</commit_message>
<xml_diff>
--- a/Kim11-2-11-Titrasyon.docx
+++ b/Kim11-2-11-Titrasyon.docx
@@ -2232,8 +2232,164 @@
           <w:rFonts w:ascii="Times New Roman" w:hAnsi="Times New Roman" w:cs="Times New Roman"/>
           <w:lang w:val="tr-TR"/>
         </w:rPr>
-        <w:t>Analiz ve Keşif Atölyesi 2.11.’de derişimi bilinen bir baz çözeltisinden yararlanarak derişimi bilinmeyen bir asit çözeltisinin derişimini belirlediniz. Derişimi bilinen bir çözelti yardımıyla derişimi bilinmeyen bir çözeltinin derişimini belirlemeye yarayan analiz yöntemine titrasyon denir. Titrasyonda kullanılan ve derişimi tam olarak bilinen çözeltiye standart çözelti denir. Standart çözelti bir bürete konur ve derişimi bilinmeyen çözeltinin belirli bir hacmini içeren erlenmayere damla damla eklenir; bu sırada iki çözeltideki maddeler arasında bir kimyasal tepkime gerçekleşir. Büret, alt ucunda musluk bulunan ve üzerinde 0,1 mL’lik bölmeler yer alan dereceli bir cam borudur; eklenen çözeltinin hacminin duyarlı biçimde ölçülmesini sağlar. Titrasyonlar, gerçekleşen tepkimenin türüne göre asit-baz, çöktürme ve redoks (indirgenme-yükseltgenme) titrasyonları olarak sınıflandırılır. Derişimi bilinmeyen kuvvetli asit ya da kuvvetli baz çözeltisinin derişimini kuvvetli bir baz ya da kuvvetli bir asit kullanarak belirlemek için yapılan titrasyona kuvvetli asit-kuvvetli baz titrasyonu denir.</w:t>
-      </w:r>
+        <w:t>Analiz ve Keşif Atölyesi 2.11.’de derişimi bilinen bir baz çözeltisinden yararlanarak derişimi bilinmeyen bir asit çözeltisinin derişimini belirlediniz. Derişimi bilinen bir çözelti yardımıyla derişimi bilinmeyen bir çözeltinin derişimini belirlemeye yarayan analiz yöntemine titrasyon denir. Titrasyonda kullanılan ve derişimi tam olarak bilinen çözeltiye standart çözelti denir. Standart çözelti bir bürete konur ve derişimi bilinmeyen çözeltinin belirli bir hacmini içeren erlenmayere damla damla eklenir (Görsel C); bu sırada iki çözeltideki maddeler arasında bir kimyasal tepkime gerçekleşir. Büret, alt ucunda musluk bulunan ve üzerinde 0,1 mL’lik bölmeler yer alan dereceli bir cam borudur (Görsel D); eklenen çözeltinin hacminin duyarlı biçimde ölçülmesini sağlar. Titrasyonlar, gerçekleşen tepkimenin türüne göre asit-baz, çöktürme ve redoks (indirgenme-yükseltgenme) titrasyonları olarak sınıflandırılır. Derişimi bilinmeyen kuvvetli asit ya da kuvvetli baz çözeltisinin derişimini kuvvetli bir baz ya da kuvvetli bir asit kullanarak belirlemek için yapılan titrasyona kuvvetli asit-kuvvetli baz titrasyonu denir.</w:t>
+      </w:r>
+    </w:p>
+    <w:tbl>
+      <w:tblPr>
+        <w:tblW w:w="9000" w:type="dxa"/>
+        <w:jc w:val="center"/>
+        <w:tblBorders>
+          <w:top w:val="nil"/>
+          <w:left w:val="nil"/>
+          <w:bottom w:val="nil"/>
+          <w:right w:val="nil"/>
+          <w:insideH w:val="nil"/>
+          <w:insideV w:val="nil"/>
+        </w:tblBorders>
+        <w:tblLayout w:type="fixed"/>
+      </w:tblPr>
+      <w:tblGrid>
+        <w:gridCol w:w="4500"/>
+        <w:gridCol w:w="4500"/>
+      </w:tblGrid>
+      <w:tr>
+        <w:tc>
+          <w:tcPr>
+            <w:tcW w:w="4500" w:type="dxa"/>
+          </w:tcPr>
+          <w:p>
+            <w:pPr>
+              <w:jc w:val="center"/>
+            </w:pPr>
+            <w:r>
+              <w:drawing>
+                <wp:inline xmlns:a="http://schemas.openxmlformats.org/drawingml/2006/main" xmlns:pic="http://schemas.openxmlformats.org/drawingml/2006/picture">
+                  <wp:extent cx="2628000" cy="3454204"/>
+                  <wp:docPr id="900014" name="Picture 900014"/>
+                  <wp:cNvGraphicFramePr>
+                    <a:graphicFrameLocks noChangeAspect="1"/>
+                  </wp:cNvGraphicFramePr>
+                  <a:graphic>
+                    <a:graphicData uri="http://schemas.openxmlformats.org/drawingml/2006/picture">
+                      <pic:pic>
+                        <pic:nvPicPr>
+                          <pic:cNvPr id="0" name="k11_211_duzenek.png"/>
+                          <pic:cNvPicPr/>
+                        </pic:nvPicPr>
+                        <pic:blipFill>
+                          <a:blip r:embed="rId15"/>
+                          <a:stretch>
+                            <a:fillRect/>
+                          </a:stretch>
+                        </pic:blipFill>
+                        <pic:spPr>
+                          <a:xfrm>
+                            <a:off x="0" y="0"/>
+                            <a:ext cx="2628000" cy="3454204"/>
+                          </a:xfrm>
+                          <a:prstGeom prst="rect"/>
+                        </pic:spPr>
+                      </pic:pic>
+                    </a:graphicData>
+                  </a:graphic>
+                </wp:inline>
+              </w:drawing>
+            </w:r>
+          </w:p>
+          <w:p>
+            <w:pPr>
+              <w:jc w:val="center"/>
+            </w:pPr>
+            <w:r>
+              <w:rPr>
+                <w:rFonts w:ascii="Times New Roman" w:hAnsi="Times New Roman" w:cs="Times New Roman"/>
+                <w:b/>
+                <w:bCs/>
+                <w:lang w:val="tr-TR"/>
+              </w:rPr>
+              <w:t xml:space="preserve">Görsel C:</w:t>
+            </w:r>
+            <w:r>
+              <w:rPr>
+                <w:rFonts w:ascii="Times New Roman" w:hAnsi="Times New Roman" w:cs="Times New Roman"/>
+                <w:lang w:val="tr-TR"/>
+              </w:rPr>
+              <w:t xml:space="preserve"> Titrasyon düzeneği</w:t>
+            </w:r>
+          </w:p>
+        </w:tc>
+        <w:tc>
+          <w:tcPr>
+            <w:tcW w:w="4500" w:type="dxa"/>
+          </w:tcPr>
+          <w:p>
+            <w:pPr>
+              <w:jc w:val="center"/>
+            </w:pPr>
+            <w:r>
+              <w:drawing>
+                <wp:inline xmlns:a="http://schemas.openxmlformats.org/drawingml/2006/main" xmlns:pic="http://schemas.openxmlformats.org/drawingml/2006/picture">
+                  <wp:extent cx="2628000" cy="3454204"/>
+                  <wp:docPr id="900015" name="Picture 900015"/>
+                  <wp:cNvGraphicFramePr>
+                    <a:graphicFrameLocks noChangeAspect="1"/>
+                  </wp:cNvGraphicFramePr>
+                  <a:graphic>
+                    <a:graphicData uri="http://schemas.openxmlformats.org/drawingml/2006/picture">
+                      <pic:pic>
+                        <pic:nvPicPr>
+                          <pic:cNvPr id="0" name="k11_211_buret_okuma.png"/>
+                          <pic:cNvPicPr/>
+                        </pic:nvPicPr>
+                        <pic:blipFill>
+                          <a:blip r:embed="rId16"/>
+                          <a:stretch>
+                            <a:fillRect/>
+                          </a:stretch>
+                        </pic:blipFill>
+                        <pic:spPr>
+                          <a:xfrm>
+                            <a:off x="0" y="0"/>
+                            <a:ext cx="2628000" cy="3454204"/>
+                          </a:xfrm>
+                          <a:prstGeom prst="rect"/>
+                        </pic:spPr>
+                      </pic:pic>
+                    </a:graphicData>
+                  </a:graphic>
+                </wp:inline>
+              </w:drawing>
+            </w:r>
+          </w:p>
+          <w:p>
+            <w:pPr>
+              <w:jc w:val="center"/>
+            </w:pPr>
+            <w:r>
+              <w:rPr>
+                <w:rFonts w:ascii="Times New Roman" w:hAnsi="Times New Roman" w:cs="Times New Roman"/>
+                <w:b/>
+                <w:bCs/>
+                <w:lang w:val="tr-TR"/>
+              </w:rPr>
+              <w:t xml:space="preserve">Görsel D:</w:t>
+            </w:r>
+            <w:r>
+              <w:rPr>
+                <w:rFonts w:ascii="Times New Roman" w:hAnsi="Times New Roman" w:cs="Times New Roman"/>
+                <w:lang w:val="tr-TR"/>
+              </w:rPr>
+              <w:t xml:space="preserve"> Büretteki hacmin okunması</w:t>
+            </w:r>
+          </w:p>
+        </w:tc>
+      </w:tr>
+    </w:tbl>
+    <w:p>
+      <w:pPr>
+        <w:jc w:val="center"/>
+      </w:pPr>
     </w:p>
     <w:p>
       <w:pPr>

</xml_diff>

<commit_message>
2.11 Bilgi Kosesi 2.2: otomatik titrator ve sut kalite kontrolu gorselleri eklendi (Shutter 2842124219, 2843514723)
</commit_message>
<xml_diff>
--- a/Kim11-2-11-Titrasyon.docx
+++ b/Kim11-2-11-Titrasyon.docx
@@ -879,7 +879,6 @@
       <w:r>
         <w:rPr>
           <w:rFonts w:ascii="Times New Roman" w:hAnsi="Times New Roman" w:cs="Times New Roman"/>
-          <w:b w:val="0"/>
           <w:highlight w:val="yellow"/>
           <w:lang w:val="tr-TR"/>
         </w:rPr>
@@ -1369,6 +1368,7 @@
           <w:rFonts w:ascii="Times New Roman" w:hAnsi="Times New Roman" w:cs="Times New Roman"/>
           <w:lang w:val="tr-TR"/>
         </w:rPr>
+        <w:lastRenderedPageBreak/>
         <w:t>Planladığınız deneyi grubunuzla uygulayınız. Her denemede büretteki ilk ve son hacimleri göz hizasından okuyarak yukarıdaki tabloya kaydediniz. Deney boyunca üstlendiğiniz görevde etkin rol alınız; denemeler arasında beklemediğiniz bir fark ortaya çıkarsa nedenini merakla sorgulayınız.</w:t>
       </w:r>
     </w:p>
@@ -1385,7 +1385,6 @@
           <w:rFonts w:ascii="Times New Roman" w:hAnsi="Times New Roman" w:cs="Times New Roman"/>
           <w:lang w:val="tr-TR"/>
         </w:rPr>
-        <w:lastRenderedPageBreak/>
         <w:t>Okulunuzda laboratuvar imkânı yoksa aşağıdaki örnek deney verilerini kullanabilirsiniz.</w:t>
       </w:r>
     </w:p>
@@ -1874,6 +1873,7 @@
           <w:noProof/>
           <w:lang w:val="tr-TR"/>
         </w:rPr>
+        <w:lastRenderedPageBreak/>
         <mc:AlternateContent>
           <mc:Choice Requires="wps">
             <w:drawing>
@@ -2002,7 +2002,6 @@
           <w:rFonts w:ascii="Times New Roman" w:hAnsi="Times New Roman" w:cs="Times New Roman"/>
           <w:lang w:val="tr-TR"/>
         </w:rPr>
-        <w:lastRenderedPageBreak/>
         <w:t>Karekodda verilen “Öz Değerlendirme Formu” ile başlangıçta hedeflediğiniz noktaya ulaşma durumunuzu, bu süreci kolaylaştıran davranışlarınızı ve neleri daha farklı yapabileceğinizi değerlendiriniz.</w:t>
       </w:r>
     </w:p>
@@ -2248,12 +2247,16 @@
           <w:insideV w:val="nil"/>
         </w:tblBorders>
         <w:tblLayout w:type="fixed"/>
+        <w:tblLook w:val="04A0" w:firstRow="1" w:lastRow="0" w:firstColumn="1" w:lastColumn="0" w:noHBand="0" w:noVBand="1"/>
       </w:tblPr>
       <w:tblGrid>
         <w:gridCol w:w="4500"/>
         <w:gridCol w:w="4500"/>
       </w:tblGrid>
       <w:tr>
+        <w:trPr>
+          <w:jc w:val="center"/>
+        </w:trPr>
         <w:tc>
           <w:tcPr>
             <w:tcW w:w="4500" w:type="dxa"/>
@@ -2263,22 +2266,27 @@
               <w:jc w:val="center"/>
             </w:pPr>
             <w:r>
+              <w:rPr>
+                <w:noProof/>
+              </w:rPr>
+              <w:lastRenderedPageBreak/>
               <w:drawing>
-                <wp:inline xmlns:a="http://schemas.openxmlformats.org/drawingml/2006/main" xmlns:pic="http://schemas.openxmlformats.org/drawingml/2006/picture">
+                <wp:inline distT="0" distB="0" distL="0" distR="0" wp14:anchorId="52E7EB36" wp14:editId="26375BEC">
                   <wp:extent cx="2628000" cy="3454204"/>
+                  <wp:effectExtent l="0" t="0" r="0" b="0"/>
                   <wp:docPr id="900014" name="Picture 900014"/>
                   <wp:cNvGraphicFramePr>
-                    <a:graphicFrameLocks noChangeAspect="1"/>
+                    <a:graphicFrameLocks xmlns:a="http://schemas.openxmlformats.org/drawingml/2006/main" noChangeAspect="1"/>
                   </wp:cNvGraphicFramePr>
-                  <a:graphic>
+                  <a:graphic xmlns:a="http://schemas.openxmlformats.org/drawingml/2006/main">
                     <a:graphicData uri="http://schemas.openxmlformats.org/drawingml/2006/picture">
-                      <pic:pic>
+                      <pic:pic xmlns:pic="http://schemas.openxmlformats.org/drawingml/2006/picture">
                         <pic:nvPicPr>
                           <pic:cNvPr id="0" name="k11_211_duzenek.png"/>
                           <pic:cNvPicPr/>
                         </pic:nvPicPr>
                         <pic:blipFill>
-                          <a:blip r:embed="rId15"/>
+                          <a:blip r:embed="rId10"/>
                           <a:stretch>
                             <a:fillRect/>
                           </a:stretch>
@@ -2288,7 +2296,9 @@
                             <a:off x="0" y="0"/>
                             <a:ext cx="2628000" cy="3454204"/>
                           </a:xfrm>
-                          <a:prstGeom prst="rect"/>
+                          <a:prstGeom prst="rect">
+                            <a:avLst/>
+                          </a:prstGeom>
                         </pic:spPr>
                       </pic:pic>
                     </a:graphicData>
@@ -2308,7 +2318,7 @@
                 <w:bCs/>
                 <w:lang w:val="tr-TR"/>
               </w:rPr>
-              <w:t xml:space="preserve">Görsel C:</w:t>
+              <w:t>Görsel C:</w:t>
             </w:r>
             <w:r>
               <w:rPr>
@@ -2328,22 +2338,26 @@
               <w:jc w:val="center"/>
             </w:pPr>
             <w:r>
+              <w:rPr>
+                <w:noProof/>
+              </w:rPr>
               <w:drawing>
-                <wp:inline xmlns:a="http://schemas.openxmlformats.org/drawingml/2006/main" xmlns:pic="http://schemas.openxmlformats.org/drawingml/2006/picture">
+                <wp:inline distT="0" distB="0" distL="0" distR="0" wp14:anchorId="34CE3664" wp14:editId="66096302">
                   <wp:extent cx="2628000" cy="3454204"/>
+                  <wp:effectExtent l="0" t="0" r="0" b="0"/>
                   <wp:docPr id="900015" name="Picture 900015"/>
                   <wp:cNvGraphicFramePr>
-                    <a:graphicFrameLocks noChangeAspect="1"/>
+                    <a:graphicFrameLocks xmlns:a="http://schemas.openxmlformats.org/drawingml/2006/main" noChangeAspect="1"/>
                   </wp:cNvGraphicFramePr>
-                  <a:graphic>
+                  <a:graphic xmlns:a="http://schemas.openxmlformats.org/drawingml/2006/main">
                     <a:graphicData uri="http://schemas.openxmlformats.org/drawingml/2006/picture">
-                      <pic:pic>
+                      <pic:pic xmlns:pic="http://schemas.openxmlformats.org/drawingml/2006/picture">
                         <pic:nvPicPr>
                           <pic:cNvPr id="0" name="k11_211_buret_okuma.png"/>
                           <pic:cNvPicPr/>
                         </pic:nvPicPr>
                         <pic:blipFill>
-                          <a:blip r:embed="rId16"/>
+                          <a:blip r:embed="rId11"/>
                           <a:stretch>
                             <a:fillRect/>
                           </a:stretch>
@@ -2353,7 +2367,9 @@
                             <a:off x="0" y="0"/>
                             <a:ext cx="2628000" cy="3454204"/>
                           </a:xfrm>
-                          <a:prstGeom prst="rect"/>
+                          <a:prstGeom prst="rect">
+                            <a:avLst/>
+                          </a:prstGeom>
                         </pic:spPr>
                       </pic:pic>
                     </a:graphicData>
@@ -2373,7 +2389,7 @@
                 <w:bCs/>
                 <w:lang w:val="tr-TR"/>
               </w:rPr>
-              <w:t xml:space="preserve">Görsel D:</w:t>
+              <w:t>Görsel D:</w:t>
             </w:r>
             <w:r>
               <w:rPr>
@@ -2480,7 +2496,7 @@
           <w:rFonts w:ascii="Times New Roman" w:hAnsi="Times New Roman" w:cs="Times New Roman"/>
           <w:lang w:val="tr-TR"/>
         </w:rPr>
-        <w:t xml:space="preserve">Titrasyon boyunca çözeltinin pH’ının eklenen standart çözelti hacmine göre değişimini gösteren grafiğe titrasyon eğrisi denir. Grafik A’da 25,0 mL 0,100 M HCl çözeltisinin 0,100 M NaOH çözeltisi ile titrasyonuna ait titrasyon eğrisi verilmiştir. Başlangıçta pH değeri yavaş artar. Eş değerlik noktasına yaklaşıldığında tek bir damla bazın eklenmesi pH’ı birkaç birim değiştirir ve eğri neredeyse dikey hâle gelir. Örneğin eklenen NaOH hacmi 24,9 mL iken pH yaklaşık 3,7; 25,1 mL iken yaklaşık 10,3’tür. Bu dik bölge fenolftaleinin (pH 8,2-10,0) ve metil oranjın (pH 3,1-4,4) </w:t>
+        <w:t xml:space="preserve">Titrasyon boyunca çözeltinin pH’ının eklenen standart çözelti hacmine göre değişimini gösteren grafiğe titrasyon eğrisi denir. Grafik A’da 25,0 mL 0,100 M HCl çözeltisinin 0,100 M NaOH çözeltisi ile titrasyonuna ait titrasyon eğrisi verilmiştir. Başlangıçta pH değeri yavaş artar. Eş değerlik noktasına yaklaşıldığında tek bir damla bazın eklenmesi pH’ı birkaç birim değiştirir ve eğri neredeyse dikey hâle gelir. Örneğin eklenen NaOH hacmi 24,9 mL iken pH yaklaşık 3,7; 25,1 mL iken yaklaşık 10,3’tür. Bu dik bölge fenolftaleinin (pH 8,2-10,0) ve metil oranjın (pH 3,1-4,4) renk değiştirme aralıklarını kapsadığı için her iki indikatör de kuvvetli asit-kuvvetli baz titrasyonlarında kullanılabilir; iki indikatörle belirlenen dönüm noktası hacimleri arasındaki fark ihmal edilecek kadar küçüktür. Renk değiştirme aralığı eş değerlik noktasını içine alan bromtimol </w:t>
       </w:r>
       <w:r>
         <w:rPr>
@@ -2488,7 +2504,7 @@
           <w:lang w:val="tr-TR"/>
         </w:rPr>
         <w:lastRenderedPageBreak/>
-        <w:t>renk değiştirme aralıklarını kapsadığı için her iki indikatör de kuvvetli asit-kuvvetli baz titrasyonlarında kullanılabilir; iki indikatörle belirlenen dönüm noktası hacimleri arasındaki fark ihmal edilecek kadar küçüktür. Renk değiştirme aralığı eş değerlik noktasını içine alan bromtimol mavisi (pH 6,0-7,6) de uygun bir seçimdir. Genel olarak indikatör, renk değiştirme aralığı titrasyon eğrisinin dik bölgesine düşecek şekilde seçilir.</w:t>
+        <w:t>mavisi (pH 6,0-7,6) de uygun bir seçimdir. Genel olarak indikatör, renk değiştirme aralığı titrasyon eğrisinin dik bölgesine düşecek şekilde seçilir.</w:t>
       </w:r>
     </w:p>
     <w:p>
@@ -2519,7 +2535,7 @@
                     <pic:cNvPicPr/>
                   </pic:nvPicPr>
                   <pic:blipFill>
-                    <a:blip r:embed="rId10"/>
+                    <a:blip r:embed="rId12"/>
                     <a:stretch>
                       <a:fillRect/>
                     </a:stretch>
@@ -2589,7 +2605,23 @@
           <w:highlight w:val="yellow"/>
           <w:lang w:val="tr-TR"/>
         </w:rPr>
-        <w:t>Grafik hesaplanan değerlerle taslak olarak çizilmiştir; yayınevi tarafından vektörel olarak yeniden çizilebilir.</w:t>
+        <w:t xml:space="preserve">Grafik hesaplanan değerlerle taslak olarak çizilmiştir; </w:t>
+      </w:r>
+      <w:r>
+        <w:rPr>
+          <w:rFonts w:ascii="Times New Roman" w:hAnsi="Times New Roman" w:cs="Times New Roman"/>
+          <w:highlight w:val="yellow"/>
+          <w:lang w:val="tr-TR"/>
+        </w:rPr>
+        <w:t>dizgi</w:t>
+      </w:r>
+      <w:r>
+        <w:rPr>
+          <w:rFonts w:ascii="Times New Roman" w:hAnsi="Times New Roman" w:cs="Times New Roman"/>
+          <w:highlight w:val="yellow"/>
+          <w:lang w:val="tr-TR"/>
+        </w:rPr>
+        <w:t xml:space="preserve"> tarafından vektörel olarak yeniden çizilebilir.</w:t>
       </w:r>
     </w:p>
     <w:p>
@@ -2999,7 +3031,6 @@
           <w:bCs/>
           <w:lang w:val="tr-TR"/>
         </w:rPr>
-        <w:lastRenderedPageBreak/>
         <w:t>Örnek-Çözüm Atölyesi 2.20.</w:t>
       </w:r>
     </w:p>
@@ -3034,6 +3065,7 @@
           <w:bCs/>
           <w:lang w:val="tr-TR"/>
         </w:rPr>
+        <w:lastRenderedPageBreak/>
         <w:t>Çözüm:</w:t>
       </w:r>
     </w:p>
@@ -3606,6 +3638,169 @@
         <w:t>Titrasyon yöntemi yalnızca okul laboratuvarlarında değil, günlük hayatı doğrudan ilgilendiren pek çok alanda kullanılır. Gıda sanayisinde meyve sularının ve sirkenin asitliği, süt endüstrisinde sütün tazeliğini gösteren asitlik derecesi titrasyonla belirlenir. Su arıtma tesislerinde suyun sertliği ve alkaliliği, ilaç sanayisinde ise etken madde miktarı titrasyon yöntemleriyle kontrol edilir. Günümüzde birçok laboratuvarda pH metre ile çalışan otomatik titratörler kullanılmaktadır.</w:t>
       </w:r>
     </w:p>
+    <w:tbl>
+      <w:tblPr>
+        <w:tblW w:w="9000" w:type="dxa"/>
+        <w:jc w:val="center"/>
+        <w:tblBorders>
+          <w:top w:val="nil"/>
+          <w:left w:val="nil"/>
+          <w:bottom w:val="nil"/>
+          <w:right w:val="nil"/>
+          <w:insideH w:val="nil"/>
+          <w:insideV w:val="nil"/>
+        </w:tblBorders>
+        <w:tblLayout w:type="fixed"/>
+      </w:tblPr>
+      <w:tblGrid>
+        <w:gridCol w:w="4500"/>
+        <w:gridCol w:w="4500"/>
+      </w:tblGrid>
+      <w:tr>
+        <w:tc>
+          <w:tcPr>
+            <w:tcW w:w="4500" w:type="dxa"/>
+          </w:tcPr>
+          <w:p>
+            <w:pPr>
+              <w:jc w:val="center"/>
+            </w:pPr>
+            <w:r>
+              <w:drawing>
+                <wp:inline xmlns:a="http://schemas.openxmlformats.org/drawingml/2006/main" xmlns:pic="http://schemas.openxmlformats.org/drawingml/2006/picture">
+                  <wp:extent cx="2450090" cy="1799999"/>
+                  <wp:docPr id="900016" name="Picture 900016"/>
+                  <wp:cNvGraphicFramePr>
+                    <a:graphicFrameLocks noChangeAspect="1"/>
+                  </wp:cNvGraphicFramePr>
+                  <a:graphic>
+                    <a:graphicData uri="http://schemas.openxmlformats.org/drawingml/2006/picture">
+                      <pic:pic>
+                        <pic:nvPicPr>
+                          <pic:cNvPr id="0" name="2842124219_d.jpg"/>
+                          <pic:cNvPicPr/>
+                        </pic:nvPicPr>
+                        <pic:blipFill>
+                          <a:blip r:embed="rId17"/>
+                          <a:stretch>
+                            <a:fillRect/>
+                          </a:stretch>
+                        </pic:blipFill>
+                        <pic:spPr>
+                          <a:xfrm>
+                            <a:off x="0" y="0"/>
+                            <a:ext cx="2450090" cy="1799999"/>
+                          </a:xfrm>
+                          <a:prstGeom prst="rect"/>
+                        </pic:spPr>
+                      </pic:pic>
+                    </a:graphicData>
+                  </a:graphic>
+                </wp:inline>
+              </w:drawing>
+            </w:r>
+          </w:p>
+          <w:p>
+            <w:pPr>
+              <w:jc w:val="center"/>
+            </w:pPr>
+            <w:r>
+              <w:rPr>
+                <w:rFonts w:ascii="Times New Roman" w:hAnsi="Times New Roman" w:cs="Times New Roman"/>
+                <w:b/>
+                <w:bCs/>
+                <w:highlight w:val="yellow"/>
+                <w:lang w:val="tr-TR"/>
+              </w:rPr>
+              <w:t xml:space="preserve">Shutter id: 2842124219</w:t>
+            </w:r>
+          </w:p>
+          <w:p>
+            <w:pPr>
+              <w:jc w:val="center"/>
+            </w:pPr>
+            <w:r>
+              <w:rPr>
+                <w:rFonts w:ascii="Times New Roman" w:hAnsi="Times New Roman" w:cs="Times New Roman"/>
+                <w:lang w:val="tr-TR"/>
+              </w:rPr>
+              <w:t xml:space="preserve">Laboratuvarda kullanılan otomatik titratör</w:t>
+            </w:r>
+          </w:p>
+        </w:tc>
+        <w:tc>
+          <w:tcPr>
+            <w:tcW w:w="4500" w:type="dxa"/>
+          </w:tcPr>
+          <w:p>
+            <w:pPr>
+              <w:jc w:val="center"/>
+            </w:pPr>
+            <w:r>
+              <w:drawing>
+                <wp:inline xmlns:a="http://schemas.openxmlformats.org/drawingml/2006/main" xmlns:pic="http://schemas.openxmlformats.org/drawingml/2006/picture">
+                  <wp:extent cx="2588686" cy="1800000"/>
+                  <wp:docPr id="900017" name="Picture 900017"/>
+                  <wp:cNvGraphicFramePr>
+                    <a:graphicFrameLocks noChangeAspect="1"/>
+                  </wp:cNvGraphicFramePr>
+                  <a:graphic>
+                    <a:graphicData uri="http://schemas.openxmlformats.org/drawingml/2006/picture">
+                      <pic:pic>
+                        <pic:nvPicPr>
+                          <pic:cNvPr id="0" name="2843514723_d.jpg"/>
+                          <pic:cNvPicPr/>
+                        </pic:nvPicPr>
+                        <pic:blipFill>
+                          <a:blip r:embed="rId18"/>
+                          <a:stretch>
+                            <a:fillRect/>
+                          </a:stretch>
+                        </pic:blipFill>
+                        <pic:spPr>
+                          <a:xfrm>
+                            <a:off x="0" y="0"/>
+                            <a:ext cx="2588686" cy="1800000"/>
+                          </a:xfrm>
+                          <a:prstGeom prst="rect"/>
+                        </pic:spPr>
+                      </pic:pic>
+                    </a:graphicData>
+                  </a:graphic>
+                </wp:inline>
+              </w:drawing>
+            </w:r>
+          </w:p>
+          <w:p>
+            <w:pPr>
+              <w:jc w:val="center"/>
+            </w:pPr>
+            <w:r>
+              <w:rPr>
+                <w:rFonts w:ascii="Times New Roman" w:hAnsi="Times New Roman" w:cs="Times New Roman"/>
+                <w:b/>
+                <w:bCs/>
+                <w:highlight w:val="yellow"/>
+                <w:lang w:val="tr-TR"/>
+              </w:rPr>
+              <w:t xml:space="preserve">Shutter id: 2843514723</w:t>
+            </w:r>
+          </w:p>
+          <w:p>
+            <w:pPr>
+              <w:jc w:val="center"/>
+            </w:pPr>
+            <w:r>
+              <w:rPr>
+                <w:rFonts w:ascii="Times New Roman" w:hAnsi="Times New Roman" w:cs="Times New Roman"/>
+                <w:lang w:val="tr-TR"/>
+              </w:rPr>
+              <w:t xml:space="preserve">Süt örneklerinin kalite kontrolü</w:t>
+            </w:r>
+          </w:p>
+        </w:tc>
+      </w:tr>
+    </w:tbl>
     <w:p>
       <w:pPr>
         <w:pStyle w:val="ListParagraph"/>
@@ -3806,7 +4001,6 @@
           <w:rFonts w:ascii="Times New Roman" w:hAnsi="Times New Roman" w:cs="Times New Roman"/>
           <w:lang w:val="tr-TR"/>
         </w:rPr>
-        <w:lastRenderedPageBreak/>
         <w:t>25,0 mL NaOH çözeltisini titre etmek için 0,100 M H</w:t>
       </w:r>
       <w:r>
@@ -4387,7 +4581,6 @@
           <w:rFonts w:ascii="Times New Roman" w:hAnsi="Times New Roman" w:cs="Times New Roman"/>
           <w:lang w:val="tr-TR"/>
         </w:rPr>
-        <w:lastRenderedPageBreak/>
         <w:t>Petrucci, Herring, Madura, Bissonnette, General Chemistry (asit-baz titrasyonları bölümü)</w:t>
       </w:r>
     </w:p>
@@ -4407,6 +4600,7 @@
           <w:highlight w:val="yellow"/>
           <w:lang w:val="tr-TR"/>
         </w:rPr>
+        <w:lastRenderedPageBreak/>
         <w:t xml:space="preserve">NOT: </w:t>
       </w:r>
       <w:r>
@@ -4419,8 +4613,8 @@
       </w:r>
     </w:p>
     <w:sectPr>
-      <w:footerReference w:type="even" r:id="rId11"/>
-      <w:footerReference w:type="default" r:id="rId12"/>
+      <w:footerReference w:type="even" r:id="rId13"/>
+      <w:footerReference w:type="default" r:id="rId14"/>
       <w:pgSz w:w="12240" w:h="15840"/>
       <w:pgMar w:top="1440" w:right="1440" w:bottom="1440" w:left="1440" w:header="708" w:footer="708" w:gutter="0"/>
       <w:cols w:space="708"/>

</xml_diff>